<commit_message>
Regenerate documents and decks, add Technology Architecture v2
- Update 9 generators (demo scripts, setup/creation guides, glossary
  Excel, architecture and demo overview decks, carriers, governance)
- Regenerate all 38 Word/Excel documents and both PPTX decks
- Add MCG_Technology_Architecture_v2.pptx

Co-Authored-By: Claude Fable 5 <noreply@anthropic.com>
</commit_message>
<xml_diff>
--- a/documents/MCG_Creation_Guide_Automations_Pipelines.docx
+++ b/documents/MCG_Creation_Guide_Automations_Pipelines.docx
@@ -7057,7 +7057,7 @@
                 <w:sz w:val="19"/>
                 <w:szCs w:val="19"/>
               </w:rPr>
-              <w:t xml:space="preserve">order_timeline</w:t>
+              <w:t xml:space="preserve">orders_enriched (enriched)</w:t>
             </w:r>
           </w:p>
         </w:tc>
@@ -13266,631 +13266,6 @@
           </w:p>
         </w:tc>
       </w:tr>
-      <w:tr>
-        <w:tc>
-          <w:tcPr>
-            <w:shd w:color="F6F7F8" w:val="solid"/>
-            <w:tcMar>
-              <w:top w:type="dxa" w:w="30"/>
-              <w:left w:type="dxa" w:w="80"/>
-              <w:bottom w:type="dxa" w:w="30"/>
-              <w:right w:type="dxa" w:w="80"/>
-            </w:tcMar>
-          </w:tcPr>
-          <w:p>
-            <w:pPr>
-              <w:spacing w:after="0"/>
-            </w:pPr>
-            <w:r>
-              <w:rPr>
-                <w:rFonts w:ascii="Inter" w:cs="Inter" w:eastAsia="Inter" w:hAnsi="Inter"/>
-                <w:color w:val="454659"/>
-                <w:sz w:val="19"/>
-                <w:szCs w:val="19"/>
-              </w:rPr>
-              <w:t xml:space="preserve">cold_chain_compliance</w:t>
-            </w:r>
-          </w:p>
-        </w:tc>
-        <w:tc>
-          <w:tcPr>
-            <w:shd w:color="F6F7F8" w:val="solid"/>
-            <w:tcMar>
-              <w:top w:type="dxa" w:w="30"/>
-              <w:left w:type="dxa" w:w="80"/>
-              <w:bottom w:type="dxa" w:w="30"/>
-              <w:right w:type="dxa" w:w="80"/>
-            </w:tcMar>
-          </w:tcPr>
-          <w:p>
-            <w:pPr>
-              <w:spacing w:after="0"/>
-            </w:pPr>
-            <w:r>
-              <w:rPr>
-                <w:rFonts w:ascii="Inter" w:cs="Inter" w:eastAsia="Inter" w:hAnsi="Inter"/>
-                <w:color w:val="454659"/>
-                <w:sz w:val="19"/>
-                <w:szCs w:val="19"/>
-              </w:rPr>
-              <w:t xml:space="preserve">iot_normalized, shipments_canonical</w:t>
-            </w:r>
-          </w:p>
-        </w:tc>
-        <w:tc>
-          <w:tcPr>
-            <w:shd w:color="F6F7F8" w:val="solid"/>
-            <w:tcMar>
-              <w:top w:type="dxa" w:w="30"/>
-              <w:left w:type="dxa" w:w="80"/>
-              <w:bottom w:type="dxa" w:w="30"/>
-              <w:right w:type="dxa" w:w="80"/>
-            </w:tcMar>
-          </w:tcPr>
-          <w:p>
-            <w:pPr>
-              <w:spacing w:after="0"/>
-            </w:pPr>
-            <w:r>
-              <w:rPr>
-                <w:rFonts w:ascii="Inter" w:cs="Inter" w:eastAsia="Inter" w:hAnsi="Inter"/>
-                <w:color w:val="454659"/>
-                <w:sz w:val="19"/>
-                <w:szCs w:val="19"/>
-              </w:rPr>
-              <w:t xml:space="preserve">5 min</w:t>
-            </w:r>
-          </w:p>
-        </w:tc>
-        <w:tc>
-          <w:tcPr>
-            <w:shd w:color="F6F7F8" w:val="solid"/>
-            <w:tcMar>
-              <w:top w:type="dxa" w:w="30"/>
-              <w:left w:type="dxa" w:w="80"/>
-              <w:bottom w:type="dxa" w:w="30"/>
-              <w:right w:type="dxa" w:w="80"/>
-            </w:tcMar>
-          </w:tcPr>
-          <w:p>
-            <w:pPr>
-              <w:spacing w:after="0"/>
-            </w:pPr>
-            <w:r>
-              <w:rPr>
-                <w:rFonts w:ascii="Inter" w:cs="Inter" w:eastAsia="Inter" w:hAnsi="Inter"/>
-                <w:color w:val="454659"/>
-                <w:sz w:val="19"/>
-                <w:szCs w:val="19"/>
-              </w:rPr>
-              <w:t xml:space="preserve">Thomas Brennan</w:t>
-            </w:r>
-          </w:p>
-        </w:tc>
-        <w:tc>
-          <w:tcPr>
-            <w:shd w:color="F6F7F8" w:val="solid"/>
-            <w:tcMar>
-              <w:top w:type="dxa" w:w="30"/>
-              <w:left w:type="dxa" w:w="80"/>
-              <w:bottom w:type="dxa" w:w="30"/>
-              <w:right w:type="dxa" w:w="80"/>
-            </w:tcMar>
-          </w:tcPr>
-          <w:p>
-            <w:pPr>
-              <w:spacing w:after="0"/>
-            </w:pPr>
-            <w:r>
-              <w:rPr>
-                <w:rFonts w:ascii="Inter" w:cs="Inter" w:eastAsia="Inter" w:hAnsi="Inter"/>
-                <w:color w:val="454659"/>
-                <w:sz w:val="19"/>
-                <w:szCs w:val="19"/>
-              </w:rPr>
-              <w:t xml:space="preserve">Exceedance count, spoilage probability</w:t>
-            </w:r>
-          </w:p>
-        </w:tc>
-      </w:tr>
-      <w:tr>
-        <w:tc>
-          <w:tcPr>
-            <w:tcMar>
-              <w:top w:type="dxa" w:w="30"/>
-              <w:left w:type="dxa" w:w="80"/>
-              <w:bottom w:type="dxa" w:w="30"/>
-              <w:right w:type="dxa" w:w="80"/>
-            </w:tcMar>
-          </w:tcPr>
-          <w:p>
-            <w:pPr>
-              <w:spacing w:after="0"/>
-            </w:pPr>
-            <w:r>
-              <w:rPr>
-                <w:rFonts w:ascii="Inter" w:cs="Inter" w:eastAsia="Inter" w:hAnsi="Inter"/>
-                <w:color w:val="454659"/>
-                <w:sz w:val="19"/>
-                <w:szCs w:val="19"/>
-              </w:rPr>
-              <w:t xml:space="preserve">product_master_360</w:t>
-            </w:r>
-          </w:p>
-        </w:tc>
-        <w:tc>
-          <w:tcPr>
-            <w:tcMar>
-              <w:top w:type="dxa" w:w="30"/>
-              <w:left w:type="dxa" w:w="80"/>
-              <w:bottom w:type="dxa" w:w="30"/>
-              <w:right w:type="dxa" w:w="80"/>
-            </w:tcMar>
-          </w:tcPr>
-          <w:p>
-            <w:pPr>
-              <w:spacing w:after="0"/>
-            </w:pPr>
-            <w:r>
-              <w:rPr>
-                <w:rFonts w:ascii="Inter" w:cs="Inter" w:eastAsia="Inter" w:hAnsi="Inter"/>
-                <w:color w:val="454659"/>
-                <w:sz w:val="19"/>
-                <w:szCs w:val="19"/>
-              </w:rPr>
-              <w:t xml:space="preserve">products_harmonized, suppliers_deduped</w:t>
-            </w:r>
-          </w:p>
-        </w:tc>
-        <w:tc>
-          <w:tcPr>
-            <w:tcMar>
-              <w:top w:type="dxa" w:w="30"/>
-              <w:left w:type="dxa" w:w="80"/>
-              <w:bottom w:type="dxa" w:w="30"/>
-              <w:right w:type="dxa" w:w="80"/>
-            </w:tcMar>
-          </w:tcPr>
-          <w:p>
-            <w:pPr>
-              <w:spacing w:after="0"/>
-            </w:pPr>
-            <w:r>
-              <w:rPr>
-                <w:rFonts w:ascii="Inter" w:cs="Inter" w:eastAsia="Inter" w:hAnsi="Inter"/>
-                <w:color w:val="454659"/>
-                <w:sz w:val="19"/>
-                <w:szCs w:val="19"/>
-              </w:rPr>
-              <w:t xml:space="preserve">1 hour</w:t>
-            </w:r>
-          </w:p>
-        </w:tc>
-        <w:tc>
-          <w:tcPr>
-            <w:tcMar>
-              <w:top w:type="dxa" w:w="30"/>
-              <w:left w:type="dxa" w:w="80"/>
-              <w:bottom w:type="dxa" w:w="30"/>
-              <w:right w:type="dxa" w:w="80"/>
-            </w:tcMar>
-          </w:tcPr>
-          <w:p>
-            <w:pPr>
-              <w:spacing w:after="0"/>
-            </w:pPr>
-            <w:r>
-              <w:rPr>
-                <w:rFonts w:ascii="Inter" w:cs="Inter" w:eastAsia="Inter" w:hAnsi="Inter"/>
-                <w:color w:val="454659"/>
-                <w:sz w:val="19"/>
-                <w:szCs w:val="19"/>
-              </w:rPr>
-              <w:t xml:space="preserve">Thomas Berger</w:t>
-            </w:r>
-          </w:p>
-        </w:tc>
-        <w:tc>
-          <w:tcPr>
-            <w:tcMar>
-              <w:top w:type="dxa" w:w="30"/>
-              <w:left w:type="dxa" w:w="80"/>
-              <w:bottom w:type="dxa" w:w="30"/>
-              <w:right w:type="dxa" w:w="80"/>
-            </w:tcMar>
-          </w:tcPr>
-          <w:p>
-            <w:pPr>
-              <w:spacing w:after="0"/>
-            </w:pPr>
-            <w:r>
-              <w:rPr>
-                <w:rFonts w:ascii="Inter" w:cs="Inter" w:eastAsia="Inter" w:hAnsi="Inter"/>
-                <w:color w:val="454659"/>
-                <w:sz w:val="19"/>
-                <w:szCs w:val="19"/>
-              </w:rPr>
-              <w:t xml:space="preserve">Weight completeness, supplier dedup, GTIN coverage</w:t>
-            </w:r>
-          </w:p>
-        </w:tc>
-      </w:tr>
-      <w:tr>
-        <w:tc>
-          <w:tcPr>
-            <w:shd w:color="F6F7F8" w:val="solid"/>
-            <w:tcMar>
-              <w:top w:type="dxa" w:w="30"/>
-              <w:left w:type="dxa" w:w="80"/>
-              <w:bottom w:type="dxa" w:w="30"/>
-              <w:right w:type="dxa" w:w="80"/>
-            </w:tcMar>
-          </w:tcPr>
-          <w:p>
-            <w:pPr>
-              <w:spacing w:after="0"/>
-            </w:pPr>
-            <w:r>
-              <w:rPr>
-                <w:rFonts w:ascii="Inter" w:cs="Inter" w:eastAsia="Inter" w:hAnsi="Inter"/>
-                <w:color w:val="454659"/>
-                <w:sz w:val="19"/>
-                <w:szCs w:val="19"/>
-              </w:rPr>
-              <w:t xml:space="preserve">customer_delivery_experience</w:t>
-            </w:r>
-          </w:p>
-        </w:tc>
-        <w:tc>
-          <w:tcPr>
-            <w:shd w:color="F6F7F8" w:val="solid"/>
-            <w:tcMar>
-              <w:top w:type="dxa" w:w="30"/>
-              <w:left w:type="dxa" w:w="80"/>
-              <w:bottom w:type="dxa" w:w="30"/>
-              <w:right w:type="dxa" w:w="80"/>
-            </w:tcMar>
-          </w:tcPr>
-          <w:p>
-            <w:pPr>
-              <w:spacing w:after="0"/>
-            </w:pPr>
-            <w:r>
-              <w:rPr>
-                <w:rFonts w:ascii="Inter" w:cs="Inter" w:eastAsia="Inter" w:hAnsi="Inter"/>
-                <w:color w:val="454659"/>
-                <w:sz w:val="19"/>
-                <w:szCs w:val="19"/>
-              </w:rPr>
-              <w:t xml:space="preserve">customers_deduped, orders_enriched</w:t>
-            </w:r>
-          </w:p>
-        </w:tc>
-        <w:tc>
-          <w:tcPr>
-            <w:shd w:color="F6F7F8" w:val="solid"/>
-            <w:tcMar>
-              <w:top w:type="dxa" w:w="30"/>
-              <w:left w:type="dxa" w:w="80"/>
-              <w:bottom w:type="dxa" w:w="30"/>
-              <w:right w:type="dxa" w:w="80"/>
-            </w:tcMar>
-          </w:tcPr>
-          <w:p>
-            <w:pPr>
-              <w:spacing w:after="0"/>
-            </w:pPr>
-            <w:r>
-              <w:rPr>
-                <w:rFonts w:ascii="Inter" w:cs="Inter" w:eastAsia="Inter" w:hAnsi="Inter"/>
-                <w:color w:val="454659"/>
-                <w:sz w:val="19"/>
-                <w:szCs w:val="19"/>
-              </w:rPr>
-              <w:t xml:space="preserve">1 hour</w:t>
-            </w:r>
-          </w:p>
-        </w:tc>
-        <w:tc>
-          <w:tcPr>
-            <w:shd w:color="F6F7F8" w:val="solid"/>
-            <w:tcMar>
-              <w:top w:type="dxa" w:w="30"/>
-              <w:left w:type="dxa" w:w="80"/>
-              <w:bottom w:type="dxa" w:w="30"/>
-              <w:right w:type="dxa" w:w="80"/>
-            </w:tcMar>
-          </w:tcPr>
-          <w:p>
-            <w:pPr>
-              <w:spacing w:after="0"/>
-            </w:pPr>
-            <w:r>
-              <w:rPr>
-                <w:rFonts w:ascii="Inter" w:cs="Inter" w:eastAsia="Inter" w:hAnsi="Inter"/>
-                <w:color w:val="454659"/>
-                <w:sz w:val="19"/>
-                <w:szCs w:val="19"/>
-              </w:rPr>
-              <w:t xml:space="preserve">Lisa Park</w:t>
-            </w:r>
-          </w:p>
-        </w:tc>
-        <w:tc>
-          <w:tcPr>
-            <w:shd w:color="F6F7F8" w:val="solid"/>
-            <w:tcMar>
-              <w:top w:type="dxa" w:w="30"/>
-              <w:left w:type="dxa" w:w="80"/>
-              <w:bottom w:type="dxa" w:w="30"/>
-              <w:right w:type="dxa" w:w="80"/>
-            </w:tcMar>
-          </w:tcPr>
-          <w:p>
-            <w:pPr>
-              <w:spacing w:after="0"/>
-            </w:pPr>
-            <w:r>
-              <w:rPr>
-                <w:rFonts w:ascii="Inter" w:cs="Inter" w:eastAsia="Inter" w:hAnsi="Inter"/>
-                <w:color w:val="454659"/>
-                <w:sz w:val="19"/>
-                <w:szCs w:val="19"/>
-              </w:rPr>
-              <w:t xml:space="preserve">WISMO rate (41%), address quality impact</w:t>
-            </w:r>
-          </w:p>
-        </w:tc>
-      </w:tr>
-      <w:tr>
-        <w:tc>
-          <w:tcPr>
-            <w:tcMar>
-              <w:top w:type="dxa" w:w="30"/>
-              <w:left w:type="dxa" w:w="80"/>
-              <w:bottom w:type="dxa" w:w="30"/>
-              <w:right w:type="dxa" w:w="80"/>
-            </w:tcMar>
-          </w:tcPr>
-          <w:p>
-            <w:pPr>
-              <w:spacing w:after="0"/>
-            </w:pPr>
-            <w:r>
-              <w:rPr>
-                <w:rFonts w:ascii="Inter" w:cs="Inter" w:eastAsia="Inter" w:hAnsi="Inter"/>
-                <w:color w:val="454659"/>
-                <w:sz w:val="19"/>
-                <w:szCs w:val="19"/>
-              </w:rPr>
-              <w:t xml:space="preserve">compliance_readiness</w:t>
-            </w:r>
-          </w:p>
-        </w:tc>
-        <w:tc>
-          <w:tcPr>
-            <w:tcMar>
-              <w:top w:type="dxa" w:w="30"/>
-              <w:left w:type="dxa" w:w="80"/>
-              <w:bottom w:type="dxa" w:w="30"/>
-              <w:right w:type="dxa" w:w="80"/>
-            </w:tcMar>
-          </w:tcPr>
-          <w:p>
-            <w:pPr>
-              <w:spacing w:after="0"/>
-            </w:pPr>
-            <w:r>
-              <w:rPr>
-                <w:rFonts w:ascii="Inter" w:cs="Inter" w:eastAsia="Inter" w:hAnsi="Inter"/>
-                <w:color w:val="454659"/>
-                <w:sz w:val="19"/>
-                <w:szCs w:val="19"/>
-              </w:rPr>
-              <w:t xml:space="preserve">products_harmonized, inventory_reconciled</w:t>
-            </w:r>
-          </w:p>
-        </w:tc>
-        <w:tc>
-          <w:tcPr>
-            <w:tcMar>
-              <w:top w:type="dxa" w:w="30"/>
-              <w:left w:type="dxa" w:w="80"/>
-              <w:bottom w:type="dxa" w:w="30"/>
-              <w:right w:type="dxa" w:w="80"/>
-            </w:tcMar>
-          </w:tcPr>
-          <w:p>
-            <w:pPr>
-              <w:spacing w:after="0"/>
-            </w:pPr>
-            <w:r>
-              <w:rPr>
-                <w:rFonts w:ascii="Inter" w:cs="Inter" w:eastAsia="Inter" w:hAnsi="Inter"/>
-                <w:color w:val="454659"/>
-                <w:sz w:val="19"/>
-                <w:szCs w:val="19"/>
-              </w:rPr>
-              <w:t xml:space="preserve">Daily</w:t>
-            </w:r>
-          </w:p>
-        </w:tc>
-        <w:tc>
-          <w:tcPr>
-            <w:tcMar>
-              <w:top w:type="dxa" w:w="30"/>
-              <w:left w:type="dxa" w:w="80"/>
-              <w:bottom w:type="dxa" w:w="30"/>
-              <w:right w:type="dxa" w:w="80"/>
-            </w:tcMar>
-          </w:tcPr>
-          <w:p>
-            <w:pPr>
-              <w:spacing w:after="0"/>
-            </w:pPr>
-            <w:r>
-              <w:rPr>
-                <w:rFonts w:ascii="Inter" w:cs="Inter" w:eastAsia="Inter" w:hAnsi="Inter"/>
-                <w:color w:val="454659"/>
-                <w:sz w:val="19"/>
-                <w:szCs w:val="19"/>
-              </w:rPr>
-              <w:t xml:space="preserve">Dr. Elena Vasquez</w:t>
-            </w:r>
-          </w:p>
-        </w:tc>
-        <w:tc>
-          <w:tcPr>
-            <w:tcMar>
-              <w:top w:type="dxa" w:w="30"/>
-              <w:left w:type="dxa" w:w="80"/>
-              <w:bottom w:type="dxa" w:w="30"/>
-              <w:right w:type="dxa" w:w="80"/>
-            </w:tcMar>
-          </w:tcPr>
-          <w:p>
-            <w:pPr>
-              <w:spacing w:after="0"/>
-            </w:pPr>
-            <w:r>
-              <w:rPr>
-                <w:rFonts w:ascii="Inter" w:cs="Inter" w:eastAsia="Inter" w:hAnsi="Inter"/>
-                <w:color w:val="454659"/>
-                <w:sz w:val="19"/>
-                <w:szCs w:val="19"/>
-              </w:rPr>
-              <w:t xml:space="preserve">Lot capture rate (85%), traceability completeness</w:t>
-            </w:r>
-          </w:p>
-        </w:tc>
-      </w:tr>
-      <w:tr>
-        <w:tc>
-          <w:tcPr>
-            <w:shd w:color="F6F7F8" w:val="solid"/>
-            <w:tcMar>
-              <w:top w:type="dxa" w:w="30"/>
-              <w:left w:type="dxa" w:w="80"/>
-              <w:bottom w:type="dxa" w:w="30"/>
-              <w:right w:type="dxa" w:w="80"/>
-            </w:tcMar>
-          </w:tcPr>
-          <w:p>
-            <w:pPr>
-              <w:spacing w:after="0"/>
-            </w:pPr>
-            <w:r>
-              <w:rPr>
-                <w:rFonts w:ascii="Inter" w:cs="Inter" w:eastAsia="Inter" w:hAnsi="Inter"/>
-                <w:color w:val="454659"/>
-                <w:sz w:val="19"/>
-                <w:szCs w:val="19"/>
-              </w:rPr>
-              <w:t xml:space="preserve">operational_cost_impact</w:t>
-            </w:r>
-          </w:p>
-        </w:tc>
-        <w:tc>
-          <w:tcPr>
-            <w:shd w:color="F6F7F8" w:val="solid"/>
-            <w:tcMar>
-              <w:top w:type="dxa" w:w="30"/>
-              <w:left w:type="dxa" w:w="80"/>
-              <w:bottom w:type="dxa" w:w="30"/>
-              <w:right w:type="dxa" w:w="80"/>
-            </w:tcMar>
-          </w:tcPr>
-          <w:p>
-            <w:pPr>
-              <w:spacing w:after="0"/>
-            </w:pPr>
-            <w:r>
-              <w:rPr>
-                <w:rFonts w:ascii="Inter" w:cs="Inter" w:eastAsia="Inter" w:hAnsi="Inter"/>
-                <w:color w:val="454659"/>
-                <w:sz w:val="19"/>
-                <w:szCs w:val="19"/>
-              </w:rPr>
-              <w:t xml:space="preserve">All Silver tables</w:t>
-            </w:r>
-          </w:p>
-        </w:tc>
-        <w:tc>
-          <w:tcPr>
-            <w:shd w:color="F6F7F8" w:val="solid"/>
-            <w:tcMar>
-              <w:top w:type="dxa" w:w="30"/>
-              <w:left w:type="dxa" w:w="80"/>
-              <w:bottom w:type="dxa" w:w="30"/>
-              <w:right w:type="dxa" w:w="80"/>
-            </w:tcMar>
-          </w:tcPr>
-          <w:p>
-            <w:pPr>
-              <w:spacing w:after="0"/>
-            </w:pPr>
-            <w:r>
-              <w:rPr>
-                <w:rFonts w:ascii="Inter" w:cs="Inter" w:eastAsia="Inter" w:hAnsi="Inter"/>
-                <w:color w:val="454659"/>
-                <w:sz w:val="19"/>
-                <w:szCs w:val="19"/>
-              </w:rPr>
-              <w:t xml:space="preserve">Daily</w:t>
-            </w:r>
-          </w:p>
-        </w:tc>
-        <w:tc>
-          <w:tcPr>
-            <w:shd w:color="F6F7F8" w:val="solid"/>
-            <w:tcMar>
-              <w:top w:type="dxa" w:w="30"/>
-              <w:left w:type="dxa" w:w="80"/>
-              <w:bottom w:type="dxa" w:w="30"/>
-              <w:right w:type="dxa" w:w="80"/>
-            </w:tcMar>
-          </w:tcPr>
-          <w:p>
-            <w:pPr>
-              <w:spacing w:after="0"/>
-            </w:pPr>
-            <w:r>
-              <w:rPr>
-                <w:rFonts w:ascii="Inter" w:cs="Inter" w:eastAsia="Inter" w:hAnsi="Inter"/>
-                <w:color w:val="454659"/>
-                <w:sz w:val="19"/>
-                <w:szCs w:val="19"/>
-              </w:rPr>
-              <w:t xml:space="preserve">CFO Office</w:t>
-            </w:r>
-          </w:p>
-        </w:tc>
-        <w:tc>
-          <w:tcPr>
-            <w:shd w:color="F6F7F8" w:val="solid"/>
-            <w:tcMar>
-              <w:top w:type="dxa" w:w="30"/>
-              <w:left w:type="dxa" w:w="80"/>
-              <w:bottom w:type="dxa" w:w="30"/>
-              <w:right w:type="dxa" w:w="80"/>
-            </w:tcMar>
-          </w:tcPr>
-          <w:p>
-            <w:pPr>
-              <w:spacing w:after="0"/>
-            </w:pPr>
-            <w:r>
-              <w:rPr>
-                <w:rFonts w:ascii="Inter" w:cs="Inter" w:eastAsia="Inter" w:hAnsi="Inter"/>
-                <w:color w:val="454659"/>
-                <w:sz w:val="19"/>
-                <w:szCs w:val="19"/>
-              </w:rPr>
-              <w:t xml:space="preserve">Cost by nightmare ($127M annual), trends</w:t>
-            </w:r>
-          </w:p>
-        </w:tc>
-      </w:tr>
     </w:tbl>
     <w:p>
       <w:pPr>
@@ -16442,7 +15817,7 @@
                 <w:sz w:val="19"/>
                 <w:szCs w:val="19"/>
               </w:rPr>
-              <w:t xml:space="preserve">Data Product: Cold Chain Compliance; Filter: exceedance_minutes &gt;= 15 AND alert_sent = false; Fields: shipment_id, route, carrier, max_temp_celsius, exceedance_minutes, estimated_loss_usd, product_type</w:t>
+              <w:t xml:space="preserve">Silver Table: silver.iot_normalized; Filter: exceedance_minutes &gt;= 15 AND alert_sent = false; Fields: shipment_id, route, carrier, max_temp_celsius, exceedance_minutes, estimated_loss_usd, product_type</w:t>
             </w:r>
           </w:p>
         </w:tc>
@@ -18139,7 +17514,7 @@
                 <w:sz w:val="19"/>
                 <w:szCs w:val="19"/>
               </w:rPr>
-              <w:t xml:space="preserve">Data Product: Customer Delivery Experience; Filter: wismo_rate &gt; 0.40; Group by: carrier, destination_region</w:t>
+              <w:t xml:space="preserve">Data Product: Last Mile Performance; Filter: wismo_flag = true AND on_time_pct &lt; 0.60; Group by: carrier, destination_region</w:t>
             </w:r>
           </w:p>
         </w:tc>
@@ -19054,7 +18429,7 @@
                 <w:sz w:val="19"/>
                 <w:szCs w:val="19"/>
               </w:rPr>
-              <w:t xml:space="preserve">Refresh downstream Gold tables: customer_delivery_experience, last_mile_performance</w:t>
+              <w:t xml:space="preserve">Refresh downstream tables: silver.orders_enriched, gold.last_mile_performance</w:t>
             </w:r>
           </w:p>
         </w:tc>

</xml_diff>

<commit_message>
Add gateway-bound source connections, Data Gateway ID UI, and help content
deploy-to-qlik.js: create Data-Movement-gateway-bound PostgreSQL source via qConnectStatement + agentId (template-driven from deploy/templates/), targeting the data space; Salesforce/Kafka/S3/Athena skip with precise UI guidance. deploy-ui.js: Data Gateway ID field (with how-to-find) in its own section above the connections; Salesforce Connected-App (OAuth) fields; Start/Stop Gateway + Register Gateway buttons. pull-connection-template.js + templates/: capture a UI-made connection as a parameterized template. generators/* + setup_guide.md: gateway-registration + source-connection help across demo scripts, decks, and Word guides (regenerated).

Co-Authored-By: Claude Opus 4.8 <noreply@anthropic.com>
</commit_message>
<xml_diff>
--- a/documents/MCG_Creation_Guide_Automations_Pipelines.docx
+++ b/documents/MCG_Creation_Guide_Automations_Pipelines.docx
@@ -1035,7 +1035,7 @@
           <w:sz w:val="21"/>
           <w:szCs w:val="21"/>
         </w:rPr>
-        <w:t xml:space="preserve">PostgreSQL connection created (see Setup Guide Section 7.1)</w:t>
+        <w:t xml:space="preserve">PostgreSQL connection created and bound to the gateway (see Setup Guide Sections 3.7–3.8, or the steps below)</w:t>
       </w:r>
     </w:p>
     <w:p>
@@ -1086,6 +1086,279 @@
         <w:t xml:space="preserve">Publication mcg_wms_pub exists (created by schema.sql)</w:t>
       </w:r>
     </w:p>
+    <w:p>
+      <w:pPr>
+        <w:spacing w:after="100" w:before="200"/>
+      </w:pPr>
+      <w:r>
+        <w:rPr>
+          <w:rFonts w:ascii="Inter" w:cs="Inter" w:eastAsia="Inter" w:hAnsi="Inter"/>
+          <w:b/>
+          <w:bCs/>
+          <w:color w:val="19416C"/>
+          <w:sz w:val="22"/>
+          <w:szCs w:val="22"/>
+        </w:rPr>
+        <w:t xml:space="preserve">Setting Up the Gateway &amp; Source Connection</w:t>
+      </w:r>
+    </w:p>
+    <w:p>
+      <w:pPr>
+        <w:spacing w:after="120"/>
+        <w:jc w:val="left"/>
+      </w:pPr>
+      <w:r>
+        <w:rPr>
+          <w:rFonts w:ascii="Inter" w:cs="Inter" w:eastAsia="Inter" w:hAnsi="Inter"/>
+          <w:b w:val="false"/>
+          <w:bCs w:val="false"/>
+          <w:i w:val="false"/>
+          <w:iCs w:val="false"/>
+          <w:color w:val="454659"/>
+          <w:sz w:val="21"/>
+          <w:szCs w:val="21"/>
+        </w:rPr>
+        <w:t xml:space="preserve">The CDC pipelines below read from a PostgreSQL source connection that routes through the Data Movement gateway. Set that up first — a one-time gateway registration plus a gateway-bound connection created in the Data Integration UI.</w:t>
+      </w:r>
+    </w:p>
+    <w:p>
+      <w:pPr>
+        <w:spacing w:after="120"/>
+        <w:jc w:val="left"/>
+      </w:pPr>
+      <w:r>
+        <w:rPr>
+          <w:rFonts w:ascii="Inter" w:cs="Inter" w:eastAsia="Inter" w:hAnsi="Inter"/>
+          <w:b/>
+          <w:bCs/>
+          <w:i w:val="false"/>
+          <w:iCs w:val="false"/>
+          <w:color w:val="454659"/>
+          <w:sz w:val="21"/>
+          <w:szCs w:val="21"/>
+        </w:rPr>
+        <w:t xml:space="preserve">1. Register the Data Movement gateway:</w:t>
+      </w:r>
+    </w:p>
+    <w:p>
+      <w:pPr>
+        <w:spacing w:after="80"/>
+        <w:ind w:left="431"/>
+      </w:pPr>
+      <w:r>
+        <w:rPr>
+          <w:rFonts w:ascii="Inter" w:cs="Inter" w:eastAsia="Inter" w:hAnsi="Inter"/>
+          <w:b/>
+          <w:bCs/>
+          <w:color w:val="006580"/>
+          <w:sz w:val="21"/>
+          <w:szCs w:val="21"/>
+        </w:rPr>
+        <w:t xml:space="preserve">1. </w:t>
+      </w:r>
+      <w:r>
+        <w:rPr>
+          <w:rFonts w:ascii="Inter" w:cs="Inter" w:eastAsia="Inter" w:hAnsi="Inter"/>
+          <w:b w:val="false"/>
+          <w:bCs w:val="false"/>
+          <w:color w:val="454659"/>
+          <w:sz w:val="21"/>
+          <w:szCs w:val="21"/>
+        </w:rPr>
+        <w:t xml:space="preserve">In the MCG Deploy UI → Local Stack &amp; Gateway, click Register Gateway / Get Token to print the registration token (or run agentctl inside the mcg-qlik-dmg container):</w:t>
+      </w:r>
+    </w:p>
+    <w:p>
+      <w:pPr>
+        <w:spacing w:after="120"/>
+        <w:jc w:val="left"/>
+      </w:pPr>
+      <w:r>
+        <w:rPr>
+          <w:rFonts w:ascii="Inter" w:cs="Inter" w:eastAsia="Inter" w:hAnsi="Inter"/>
+          <w:b/>
+          <w:bCs/>
+          <w:i w:val="false"/>
+          <w:iCs w:val="false"/>
+          <w:color w:val="454659"/>
+          <w:sz w:val="19"/>
+          <w:szCs w:val="19"/>
+        </w:rPr>
+        <w:t xml:space="preserve">$  docker exec -it mcg-qlik-dmg bash -lc "cd /opt/qlik/gateway/movement/bin &amp;&amp; ./agentctl qcs get_registration"</w:t>
+      </w:r>
+    </w:p>
+    <w:p>
+      <w:pPr>
+        <w:spacing w:after="80"/>
+        <w:ind w:left="431"/>
+      </w:pPr>
+      <w:r>
+        <w:rPr>
+          <w:rFonts w:ascii="Inter" w:cs="Inter" w:eastAsia="Inter" w:hAnsi="Inter"/>
+          <w:b/>
+          <w:bCs/>
+          <w:color w:val="006580"/>
+          <w:sz w:val="21"/>
+          <w:szCs w:val="21"/>
+        </w:rPr>
+        <w:t xml:space="preserve">2. </w:t>
+      </w:r>
+      <w:r>
+        <w:rPr>
+          <w:rFonts w:ascii="Inter" w:cs="Inter" w:eastAsia="Inter" w:hAnsi="Inter"/>
+          <w:b w:val="false"/>
+          <w:bCs w:val="false"/>
+          <w:color w:val="454659"/>
+          <w:sz w:val="21"/>
+          <w:szCs w:val="21"/>
+        </w:rPr>
+        <w:t xml:space="preserve">In Qlik Cloud → Administration → Data Gateways → Register, paste the token, name the gateway, and wait for status Connected.</w:t>
+      </w:r>
+    </w:p>
+    <w:p>
+      <w:pPr>
+        <w:spacing w:after="120"/>
+        <w:jc w:val="left"/>
+      </w:pPr>
+      <w:r>
+        <w:rPr>
+          <w:rFonts w:ascii="Inter" w:cs="Inter" w:eastAsia="Inter" w:hAnsi="Inter"/>
+          <w:b/>
+          <w:bCs/>
+          <w:i w:val="false"/>
+          <w:iCs w:val="false"/>
+          <w:color w:val="454659"/>
+          <w:sz w:val="21"/>
+          <w:szCs w:val="21"/>
+        </w:rPr>
+        <w:t xml:space="preserve">2. Create the gateway-bound PostgreSQL connection:</w:t>
+      </w:r>
+    </w:p>
+    <w:p>
+      <w:pPr>
+        <w:spacing w:after="80"/>
+        <w:ind w:left="431"/>
+      </w:pPr>
+      <w:r>
+        <w:rPr>
+          <w:rFonts w:ascii="Inter" w:cs="Inter" w:eastAsia="Inter" w:hAnsi="Inter"/>
+          <w:b/>
+          <w:bCs/>
+          <w:color w:val="006580"/>
+          <w:sz w:val="21"/>
+          <w:szCs w:val="21"/>
+        </w:rPr>
+        <w:t xml:space="preserve">1. </w:t>
+      </w:r>
+      <w:r>
+        <w:rPr>
+          <w:rFonts w:ascii="Inter" w:cs="Inter" w:eastAsia="Inter" w:hAnsi="Inter"/>
+          <w:b w:val="false"/>
+          <w:bCs w:val="false"/>
+          <w:color w:val="454659"/>
+          <w:sz w:val="21"/>
+          <w:szCs w:val="21"/>
+        </w:rPr>
+        <w:t xml:space="preserve">Data Integration → your project → Create connection → PostgreSQL.</w:t>
+      </w:r>
+    </w:p>
+    <w:p>
+      <w:pPr>
+        <w:spacing w:after="80"/>
+        <w:ind w:left="431"/>
+      </w:pPr>
+      <w:r>
+        <w:rPr>
+          <w:rFonts w:ascii="Inter" w:cs="Inter" w:eastAsia="Inter" w:hAnsi="Inter"/>
+          <w:b/>
+          <w:bCs/>
+          <w:color w:val="006580"/>
+          <w:sz w:val="21"/>
+          <w:szCs w:val="21"/>
+        </w:rPr>
+        <w:t xml:space="preserve">2. </w:t>
+      </w:r>
+      <w:r>
+        <w:rPr>
+          <w:rFonts w:ascii="Inter" w:cs="Inter" w:eastAsia="Inter" w:hAnsi="Inter"/>
+          <w:b w:val="false"/>
+          <w:bCs w:val="false"/>
+          <w:color w:val="454659"/>
+          <w:sz w:val="21"/>
+          <w:szCs w:val="21"/>
+        </w:rPr>
+        <w:t xml:space="preserve">Select the mcg-qlik-dmg Data Movement gateway, enter the WMS database host/port/database/credentials, then test and save.</w:t>
+      </w:r>
+    </w:p>
+    <w:tbl>
+      <w:tblPr>
+        <w:tblW w:type="pct" w:w="100%"/>
+        <w:tblBorders>
+          <w:top w:val="single" w:color="auto" w:sz="4"/>
+          <w:left w:val="single" w:color="auto" w:sz="4"/>
+          <w:bottom w:val="single" w:color="auto" w:sz="4"/>
+          <w:right w:val="single" w:color="auto" w:sz="4"/>
+          <w:insideH w:val="single" w:color="auto" w:sz="4"/>
+          <w:insideV w:val="single" w:color="auto" w:sz="4"/>
+        </w:tblBorders>
+      </w:tblPr>
+      <w:tblGrid>
+        <w:gridCol w:w="100"/>
+        <w:gridCol w:w="100"/>
+      </w:tblGrid>
+      <w:tr>
+        <w:tc>
+          <w:tcPr>
+            <w:tcW w:type="pct" w:w="1%"/>
+            <w:tcBorders>
+              <w:top w:val="none"/>
+              <w:left w:val="none"/>
+              <w:bottom w:val="none"/>
+              <w:right w:val="none"/>
+            </w:tcBorders>
+            <w:shd w:color="009845" w:val="solid"/>
+          </w:tcPr>
+          <w:p>
+            <w:pPr>
+              <w:spacing w:after="0"/>
+            </w:pPr>
+            <w:r>
+              <w:rPr>
+                <w:sz w:val="10"/>
+                <w:szCs w:val="10"/>
+              </w:rPr>
+              <w:t xml:space="preserve"> </w:t>
+            </w:r>
+          </w:p>
+        </w:tc>
+        <w:tc>
+          <w:tcPr>
+            <w:tcW w:type="pct" w:w="99%"/>
+            <w:shd w:color="F6F7F8" w:val="solid"/>
+            <w:tcMar>
+              <w:top w:type="dxa" w:w="80"/>
+              <w:left w:type="dxa" w:w="120"/>
+              <w:bottom w:type="dxa" w:w="80"/>
+              <w:right w:type="dxa" w:w="120"/>
+            </w:tcMar>
+          </w:tcPr>
+          <w:p>
+            <w:pPr>
+              <w:spacing w:after="0"/>
+            </w:pPr>
+            <w:r>
+              <w:rPr>
+                <w:rFonts w:ascii="Inter" w:cs="Inter" w:eastAsia="Inter" w:hAnsi="Inter"/>
+                <w:color w:val="454659"/>
+                <w:sz w:val="20"/>
+                <w:szCs w:val="20"/>
+              </w:rPr>
+              <w:t xml:space="preserve">A Data Movement gateway connection can only be created in the Data Integration UI by selecting the gateway — the public REST API cannot create it, so the MCG deploy script skips it and prints this guidance. Kafka sources need a Data Gateway - Streaming instead. Gateway setup: https://help.qlik.com/en-US/cloud-services/Subsystems/Hub/Content/Sense_Hub/Gateways/dm-gateway-setting-up.htm</w:t>
+            </w:r>
+          </w:p>
+        </w:tc>
+      </w:tr>
+    </w:tbl>
     <w:p>
       <w:pPr>
         <w:spacing w:after="100" w:before="200"/>

</xml_diff>

<commit_message>
Baseline before Salesforce->MySQL CRM migration
Snapshot of the working tree (deck/doc regeneration and Qlarity branding
work) so the CRM migration diff is readable on its own.

Co-Authored-By: Claude Opus 5 <noreply@anthropic.com>
</commit_message>
<xml_diff>
--- a/documents/MCG_Creation_Guide_Automations_Pipelines.docx
+++ b/documents/MCG_Creation_Guide_Automations_Pipelines.docx
@@ -10063,7 +10063,7 @@
           <w:sz w:val="21"/>
           <w:szCs w:val="21"/>
         </w:rPr>
-        <w:t xml:space="preserve">tAddressRowStandardize — Parse free-text address, normalize country to ISO 3166</w:t>
+        <w:t xml:space="preserve">AddressStandardizer (custom Java routine) — parse free-text address, repair country to ISO 3166, canonicalize postal codes, expand abbreviations, score 0.0-1.0</w:t>
       </w:r>
     </w:p>
     <w:p>
@@ -10087,7 +10087,7 @@
           <w:sz w:val="21"/>
           <w:szCs w:val="21"/>
         </w:rPr>
-        <w:t xml:space="preserve">tAddressRowValidate — Validate against country postal databases (PostNL, USPS, Correios)</w:t>
+        <w:t xml:space="preserve">BulkGeocoder (custom Java routine) — one bulk call geocodes the batch via public OSM Nominatim behind a 1 req/s limiter, with dedupe cache and retry backoff</w:t>
       </w:r>
     </w:p>
     <w:p>
@@ -10111,7 +10111,31 @@
           <w:sz w:val="21"/>
           <w:szCs w:val="21"/>
         </w:rPr>
-        <w:t xml:space="preserve">tGeocode — Optional geocoding for map visualizations and GPS correlation with IoT</w:t>
+        <w:t xml:space="preserve">Routing gate — GPS resolved goes to S3 then Iceberg silver.addresses_geocoded; unresolved goes to the Address Cleanup stewardship sprint</w:t>
+      </w:r>
+    </w:p>
+    <w:p>
+      <w:pPr>
+        <w:pStyle w:val="ListParagraph"/>
+        <w:numPr>
+          <w:ilvl w:val="0"/>
+          <w:numId w:val="1"/>
+        </w:numPr>
+        <w:spacing w:after="120"/>
+        <w:jc w:val="left"/>
+      </w:pPr>
+      <w:r>
+        <w:rPr>
+          <w:rFonts w:ascii="Inter" w:cs="Inter" w:eastAsia="Inter" w:hAnsi="Inter"/>
+          <w:b w:val="false"/>
+          <w:bCs w:val="false"/>
+          <w:i w:val="false"/>
+          <w:iCs w:val="false"/>
+          <w:color w:val="454659"/>
+          <w:sz w:val="21"/>
+          <w:szCs w:val="21"/>
+        </w:rPr>
+        <w:t xml:space="preserve">These replace the subscription-only tAddressRowStandardize / tAddressRowValidate / tGeocode chain — no Talend Data Quality subscription and no licensed postal reference data required.</w:t>
       </w:r>
     </w:p>
     <w:tbl>
@@ -14938,79 +14962,79 @@
                 <w:sz w:val="19"/>
                 <w:szCs w:val="19"/>
               </w:rPr>
-              <w:t xml:space="preserve">WISMO Rate Alert</w:t>
-            </w:r>
-          </w:p>
-        </w:tc>
-        <w:tc>
-          <w:tcPr>
-            <w:tcMar>
-              <w:top w:type="dxa" w:w="30"/>
-              <w:left w:type="dxa" w:w="80"/>
-              <w:bottom w:type="dxa" w:w="30"/>
-              <w:right w:type="dxa" w:w="80"/>
-            </w:tcMar>
-          </w:tcPr>
-          <w:p>
-            <w:pPr>
-              <w:spacing w:after="0"/>
-            </w:pPr>
-            <w:r>
-              <w:rPr>
-                <w:rFonts w:ascii="Inter" w:cs="Inter" w:eastAsia="Inter" w:hAnsi="Inter"/>
-                <w:color w:val="454659"/>
-                <w:sz w:val="19"/>
-                <w:szCs w:val="19"/>
-              </w:rPr>
-              <w:t xml:space="preserve">Every 30 min: WISMO &gt; 40%</w:t>
-            </w:r>
-          </w:p>
-        </w:tc>
-        <w:tc>
-          <w:tcPr>
-            <w:tcMar>
-              <w:top w:type="dxa" w:w="30"/>
-              <w:left w:type="dxa" w:w="80"/>
-              <w:bottom w:type="dxa" w:w="30"/>
-              <w:right w:type="dxa" w:w="80"/>
-            </w:tcMar>
-          </w:tcPr>
-          <w:p>
-            <w:pPr>
-              <w:spacing w:after="0"/>
-            </w:pPr>
-            <w:r>
-              <w:rPr>
-                <w:rFonts w:ascii="Inter" w:cs="Inter" w:eastAsia="Inter" w:hAnsi="Inter"/>
-                <w:color w:val="454659"/>
-                <w:sz w:val="19"/>
-                <w:szCs w:val="19"/>
-              </w:rPr>
-              <w:t xml:space="preserve">Post alert to Teams</w:t>
-            </w:r>
-          </w:p>
-        </w:tc>
-        <w:tc>
-          <w:tcPr>
-            <w:tcMar>
-              <w:top w:type="dxa" w:w="30"/>
-              <w:left w:type="dxa" w:w="80"/>
-              <w:bottom w:type="dxa" w:w="30"/>
-              <w:right w:type="dxa" w:w="80"/>
-            </w:tcMar>
-          </w:tcPr>
-          <w:p>
-            <w:pPr>
-              <w:spacing w:after="0"/>
-            </w:pPr>
-            <w:r>
-              <w:rPr>
-                <w:rFonts w:ascii="Inter" w:cs="Inter" w:eastAsia="Inter" w:hAnsi="Inter"/>
-                <w:color w:val="454659"/>
-                <w:sz w:val="19"/>
-                <w:szCs w:val="19"/>
-              </w:rPr>
-              <w:t xml:space="preserve">#mcg-customer-ops</w:t>
+              <w:t xml:space="preserve">Stewardship Sprint Summary</w:t>
+            </w:r>
+          </w:p>
+        </w:tc>
+        <w:tc>
+          <w:tcPr>
+            <w:tcMar>
+              <w:top w:type="dxa" w:w="30"/>
+              <w:left w:type="dxa" w:w="80"/>
+              <w:bottom w:type="dxa" w:w="30"/>
+              <w:right w:type="dxa" w:w="80"/>
+            </w:tcMar>
+          </w:tcPr>
+          <w:p>
+            <w:pPr>
+              <w:spacing w:after="0"/>
+            </w:pPr>
+            <w:r>
+              <w:rPr>
+                <w:rFonts w:ascii="Inter" w:cs="Inter" w:eastAsia="Inter" w:hAnsi="Inter"/>
+                <w:color w:val="454659"/>
+                <w:sz w:val="19"/>
+                <w:szCs w:val="19"/>
+              </w:rPr>
+              <w:t xml:space="preserve">Schedule: 07:00 UTC daily</w:t>
+            </w:r>
+          </w:p>
+        </w:tc>
+        <w:tc>
+          <w:tcPr>
+            <w:tcMar>
+              <w:top w:type="dxa" w:w="30"/>
+              <w:left w:type="dxa" w:w="80"/>
+              <w:bottom w:type="dxa" w:w="30"/>
+              <w:right w:type="dxa" w:w="80"/>
+            </w:tcMar>
+          </w:tcPr>
+          <w:p>
+            <w:pPr>
+              <w:spacing w:after="0"/>
+            </w:pPr>
+            <w:r>
+              <w:rPr>
+                <w:rFonts w:ascii="Inter" w:cs="Inter" w:eastAsia="Inter" w:hAnsi="Inter"/>
+                <w:color w:val="454659"/>
+                <w:sz w:val="19"/>
+                <w:szCs w:val="19"/>
+              </w:rPr>
+              <w:t xml:space="preserve">Read the Address Cleanup sprint summary</w:t>
+            </w:r>
+          </w:p>
+        </w:tc>
+        <w:tc>
+          <w:tcPr>
+            <w:tcMar>
+              <w:top w:type="dxa" w:w="30"/>
+              <w:left w:type="dxa" w:w="80"/>
+              <w:bottom w:type="dxa" w:w="30"/>
+              <w:right w:type="dxa" w:w="80"/>
+            </w:tcMar>
+          </w:tcPr>
+          <w:p>
+            <w:pPr>
+              <w:spacing w:after="0"/>
+            </w:pPr>
+            <w:r>
+              <w:rPr>
+                <w:rFonts w:ascii="Inter" w:cs="Inter" w:eastAsia="Inter" w:hAnsi="Inter"/>
+                <w:color w:val="454659"/>
+                <w:sz w:val="19"/>
+                <w:szCs w:val="19"/>
+              </w:rPr>
+              <w:t xml:space="preserve">Run title / digest</w:t>
             </w:r>
           </w:p>
         </w:tc>
@@ -17730,7 +17754,7 @@
           <w:sz w:val="26"/>
           <w:szCs w:val="26"/>
         </w:rPr>
-        <w:t xml:space="preserve">4.6 Automation 4: WISMO Rate Alert → Teams</w:t>
+        <w:t xml:space="preserve">4.6 Automation 4: Stewardship Sprint Summary</w:t>
       </w:r>
     </w:p>
     <w:p>
@@ -17749,7 +17773,7 @@
           <w:sz w:val="21"/>
           <w:szCs w:val="21"/>
         </w:rPr>
-        <w:t xml:space="preserve">Monitors the WISMO (Where Is My Order?) rate every 30 minutes. When the rate exceeds 40% for any carrier or region combination, an alert is posted to #mcg-customer-ops.</w:t>
+        <w:t xml:space="preserve">Reads the Address Cleanup sprint summary once a day and titles the run with it. This is the read-only half of the address-correction loop - safe to enable in a demo, and it proves the sprint is live without mutating anything.</w:t>
       </w:r>
     </w:p>
     <w:p>
@@ -17943,7 +17967,7 @@
                 <w:sz w:val="19"/>
                 <w:szCs w:val="19"/>
               </w:rPr>
-              <w:t xml:space="preserve">Cron: */30 * * * * (Every 30 minutes)</w:t>
+              <w:t xml:space="preserve">Cron: 0 7 * * * (Daily at 07:00 UTC)</w:t>
             </w:r>
           </w:p>
         </w:tc>
@@ -17993,31 +18017,31 @@
                 <w:sz w:val="19"/>
                 <w:szCs w:val="19"/>
               </w:rPr>
-              <w:t xml:space="preserve">Qlik Cloud → Query Data</w:t>
-            </w:r>
-          </w:p>
-        </w:tc>
-        <w:tc>
-          <w:tcPr>
-            <w:tcMar>
-              <w:top w:type="dxa" w:w="30"/>
-              <w:left w:type="dxa" w:w="80"/>
-              <w:bottom w:type="dxa" w:w="30"/>
-              <w:right w:type="dxa" w:w="80"/>
-            </w:tcMar>
-          </w:tcPr>
-          <w:p>
-            <w:pPr>
-              <w:spacing w:after="0"/>
-            </w:pPr>
-            <w:r>
-              <w:rPr>
-                <w:rFonts w:ascii="Inter" w:cs="Inter" w:eastAsia="Inter" w:hAnsi="Inter"/>
-                <w:color w:val="454659"/>
-                <w:sz w:val="19"/>
-                <w:szCs w:val="19"/>
-              </w:rPr>
-              <w:t xml:space="preserve">Data Product: Last Mile Performance; Filter: wismo_flag = true AND on_time_pct &lt; 0.60; Group by: carrier, destination_region</w:t>
+              <w:t xml:space="preserve">API Key connector → Raw API request</w:t>
+            </w:r>
+          </w:p>
+        </w:tc>
+        <w:tc>
+          <w:tcPr>
+            <w:tcMar>
+              <w:top w:type="dxa" w:w="30"/>
+              <w:left w:type="dxa" w:w="80"/>
+              <w:bottom w:type="dxa" w:w="30"/>
+              <w:right w:type="dxa" w:w="80"/>
+            </w:tcMar>
+          </w:tcPr>
+          <w:p>
+            <w:pPr>
+              <w:spacing w:after="0"/>
+            </w:pPr>
+            <w:r>
+              <w:rPr>
+                <w:rFonts w:ascii="Inter" w:cs="Inter" w:eastAsia="Inter" w:hAnsi="Inter"/>
+                <w:color w:val="454659"/>
+                <w:sz w:val="19"/>
+                <w:szCs w:val="19"/>
+              </w:rPr>
+              <w:t xml:space="preserve">GET data-governance/sprints/&lt;sprintId&gt;/external-integrations/sprint-summary</w:t>
             </w:r>
           </w:p>
         </w:tc>
@@ -18069,106 +18093,32 @@
                 <w:sz w:val="19"/>
                 <w:szCs w:val="19"/>
               </w:rPr>
-              <w:t xml:space="preserve">Control → Condition</w:t>
-            </w:r>
-          </w:p>
-        </w:tc>
-        <w:tc>
-          <w:tcPr>
-            <w:shd w:color="F6F7F8" w:val="solid"/>
-            <w:tcMar>
-              <w:top w:type="dxa" w:w="30"/>
-              <w:left w:type="dxa" w:w="80"/>
-              <w:bottom w:type="dxa" w:w="30"/>
-              <w:right w:type="dxa" w:w="80"/>
-            </w:tcMar>
-          </w:tcPr>
-          <w:p>
-            <w:pPr>
-              <w:spacing w:after="0"/>
-            </w:pPr>
-            <w:r>
-              <w:rPr>
-                <w:rFonts w:ascii="Inter" w:cs="Inter" w:eastAsia="Inter" w:hAnsi="Inter"/>
-                <w:color w:val="454659"/>
-                <w:sz w:val="19"/>
-                <w:szCs w:val="19"/>
-              </w:rPr>
-              <w:t xml:space="preserve">If results exist → continue; else → end</w:t>
-            </w:r>
-          </w:p>
-        </w:tc>
-      </w:tr>
-      <w:tr>
-        <w:tc>
-          <w:tcPr>
-            <w:tcMar>
-              <w:top w:type="dxa" w:w="30"/>
-              <w:left w:type="dxa" w:w="80"/>
-              <w:bottom w:type="dxa" w:w="30"/>
-              <w:right w:type="dxa" w:w="80"/>
-            </w:tcMar>
-          </w:tcPr>
-          <w:p>
-            <w:pPr>
-              <w:spacing w:after="0"/>
-            </w:pPr>
-            <w:r>
-              <w:rPr>
-                <w:rFonts w:ascii="Inter" w:cs="Inter" w:eastAsia="Inter" w:hAnsi="Inter"/>
-                <w:color w:val="454659"/>
-                <w:sz w:val="19"/>
-                <w:szCs w:val="19"/>
-              </w:rPr>
-              <w:t xml:space="preserve">4</w:t>
-            </w:r>
-          </w:p>
-        </w:tc>
-        <w:tc>
-          <w:tcPr>
-            <w:tcMar>
-              <w:top w:type="dxa" w:w="30"/>
-              <w:left w:type="dxa" w:w="80"/>
-              <w:bottom w:type="dxa" w:w="30"/>
-              <w:right w:type="dxa" w:w="80"/>
-            </w:tcMar>
-          </w:tcPr>
-          <w:p>
-            <w:pPr>
-              <w:spacing w:after="0"/>
-            </w:pPr>
-            <w:r>
-              <w:rPr>
-                <w:rFonts w:ascii="Inter" w:cs="Inter" w:eastAsia="Inter" w:hAnsi="Inter"/>
-                <w:color w:val="454659"/>
-                <w:sz w:val="19"/>
-                <w:szCs w:val="19"/>
-              </w:rPr>
-              <w:t xml:space="preserve">Microsoft Teams → Post Message</w:t>
-            </w:r>
-          </w:p>
-        </w:tc>
-        <w:tc>
-          <w:tcPr>
-            <w:tcMar>
-              <w:top w:type="dxa" w:w="30"/>
-              <w:left w:type="dxa" w:w="80"/>
-              <w:bottom w:type="dxa" w:w="30"/>
-              <w:right w:type="dxa" w:w="80"/>
-            </w:tcMar>
-          </w:tcPr>
-          <w:p>
-            <w:pPr>
-              <w:spacing w:after="0"/>
-            </w:pPr>
-            <w:r>
-              <w:rPr>
-                <w:rFonts w:ascii="Inter" w:cs="Inter" w:eastAsia="Inter" w:hAnsi="Inter"/>
-                <w:color w:val="454659"/>
-                <w:sz w:val="19"/>
-                <w:szCs w:val="19"/>
-              </w:rPr>
-              <w:t xml:space="preserve">Channel: #mcg-customer-ops; Include: carrier, region, WISMO rate, affected order count, dashboard link</w:t>
+              <w:t xml:space="preserve">Update run title</w:t>
+            </w:r>
+          </w:p>
+        </w:tc>
+        <w:tc>
+          <w:tcPr>
+            <w:shd w:color="F6F7F8" w:val="solid"/>
+            <w:tcMar>
+              <w:top w:type="dxa" w:w="30"/>
+              <w:left w:type="dxa" w:w="80"/>
+              <w:bottom w:type="dxa" w:w="30"/>
+              <w:right w:type="dxa" w:w="80"/>
+            </w:tcMar>
+          </w:tcPr>
+          <w:p>
+            <w:pPr>
+              <w:spacing w:after="0"/>
+            </w:pPr>
+            <w:r>
+              <w:rPr>
+                <w:rFonts w:ascii="Inter" w:cs="Inter" w:eastAsia="Inter" w:hAnsi="Inter"/>
+                <w:color w:val="454659"/>
+                <w:sz w:val="19"/>
+                <w:szCs w:val="19"/>
+              </w:rPr>
+              <w:t xml:space="preserve">Title the run with the sprint state</w:t>
             </w:r>
           </w:p>
         </w:tc>
@@ -19418,7 +19368,7 @@
                 <w:sz w:val="20"/>
                 <w:szCs w:val="20"/>
               </w:rPr>
-              <w:t xml:space="preserve">Full Talend job design: deploy/talend/README.md — two Studio jobs scheduled every 15 minutes in TMC. Job 1 (mcg_sf_address_validate) pulls Salesforce, validates address format with the routines.AddressValidator tMap function, geocodes bad addresses via the public Nominatim API (1 req/s throttle), and routes unresolved rows to the Address Cleanup stewardship campaign. Job 2 (mcg_sf_address_to_qvd) lands the validated + geocoded set as MCG_SF_Addresses_Validated.qvd in Qlik Cloud DataFiles, which the Delivery &amp; Customer Experience app loads (CustomerGeo table) on its 15-minute reload task.</w:t>
+              <w:t xml:space="preserve">Full Talend job design: deploy/talend/BUILD_BULK_ADDRESS_JOB.md — mcg_sf_address_validate_bulk, five subjobs scheduled in TMC. It pulls Salesforce Contacts, repairs and scores each address with the AddressStandardizer routine, geocodes the whole batch in ONE bulk call via public OSM Nominatim (1 req/s, dedupe cache, retry backoff, wall-clock budget), then routes on GPS resolution: resolved rows are written as timestamped CSV to S3 and loaded downstream into the Apache Iceberg table silver.addresses_geocoded; unresolved rows go to the Address Cleanup stewardship sprint. Run npm run talend:zip to produce the Studio import bundle.</w:t>
             </w:r>
           </w:p>
         </w:tc>

</xml_diff>